<commit_message>
Last version of dbt repo with business questions
</commit_message>
<xml_diff>
--- a/Big Data Engineering Instructions.docx
+++ b/Big Data Engineering Instructions.docx
@@ -3160,78 +3160,26 @@
           <w:szCs w:val="22"/>
           <w14:ligatures w14:val="none"/>
         </w:rPr>
-        <w:t xml:space="preserve">What are the demographic differences (e.g., age group distribution, household size) between the top </w:t>
-      </w:r>
-      <w:r>
-        <w:rPr>
-          <w:rFonts w:ascii="Arial" w:eastAsia="Times New Roman" w:hAnsi="Arial" w:cs="Arial"/>
-          <w:kern w:val="0"/>
-          <w:sz w:val="5"/>
-          <w:szCs w:val="5"/>
-          <w14:ligatures w14:val="none"/>
-        </w:rPr>
-        <w:t>1</w:t>
-      </w:r>
-      <w:r>
-        <w:rPr>
-          <w:rFonts w:ascii="Arial" w:eastAsia="Times New Roman" w:hAnsi="Arial" w:cs="Arial"/>
-          <w:kern w:val="0"/>
-          <w:sz w:val="22"/>
-          <w:szCs w:val="22"/>
-          <w14:ligatures w14:val="none"/>
-        </w:rPr>
-        <w:t xml:space="preserve">3 performing and lowest </w:t>
-      </w:r>
-      <w:r>
-        <w:rPr>
-          <w:rFonts w:ascii="Arial" w:eastAsia="Times New Roman" w:hAnsi="Arial" w:cs="Arial"/>
-          <w:kern w:val="0"/>
-          <w:sz w:val="5"/>
-          <w:szCs w:val="5"/>
-          <w14:ligatures w14:val="none"/>
-        </w:rPr>
-        <w:t>1</w:t>
-      </w:r>
-      <w:r>
-        <w:rPr>
-          <w:rFonts w:ascii="Arial" w:eastAsia="Times New Roman" w:hAnsi="Arial" w:cs="Arial"/>
-          <w:kern w:val="0"/>
-          <w:sz w:val="22"/>
-          <w:szCs w:val="22"/>
-          <w14:ligatures w14:val="none"/>
-        </w:rPr>
-        <w:t>3 performing LGAs based on estimated revenue per active listing over the last 1</w:t>
-      </w:r>
-      <w:r>
-        <w:rPr>
-          <w:rFonts w:ascii="Arial" w:eastAsia="Times New Roman" w:hAnsi="Arial" w:cs="Arial"/>
-          <w:kern w:val="0"/>
-          <w:sz w:val="5"/>
-          <w:szCs w:val="5"/>
-          <w14:ligatures w14:val="none"/>
-        </w:rPr>
-        <w:t>1</w:t>
-      </w:r>
-      <w:r>
-        <w:rPr>
-          <w:rFonts w:ascii="Arial" w:eastAsia="Times New Roman" w:hAnsi="Arial" w:cs="Arial"/>
-          <w:kern w:val="0"/>
-          <w:sz w:val="22"/>
-          <w:szCs w:val="22"/>
-          <w14:ligatures w14:val="none"/>
-        </w:rPr>
-        <w:t>2 months?</w:t>
-      </w:r>
-    </w:p>
-    <w:p>
-      <w:pPr>
-        <w:spacing w:after="0" w:line="240" w:lineRule="auto"/>
-        <w:rPr>
-          <w:rFonts w:ascii="Times New Roman" w:eastAsia="Times New Roman" w:hAnsi="Times New Roman" w:cs="Times New Roman"/>
-          <w:kern w:val="0"/>
-          <w14:ligatures w14:val="none"/>
-        </w:rPr>
-      </w:pPr>
+        <w:t>What are the demographic differences (e.g., age group distribution, household size) between the top 3 performing and lowest 3 performing LGAs based on estimated revenue per active listing over the last 12 months?</w:t>
+      </w:r>
+    </w:p>
+    <w:p>
+      <w:pPr>
+        <w:spacing w:after="0" w:line="240" w:lineRule="auto"/>
+        <w:rPr>
+          <w:rFonts w:ascii="Times New Roman" w:eastAsia="Times New Roman" w:hAnsi="Times New Roman" w:cs="Times New Roman"/>
+          <w:kern w:val="0"/>
+          <w14:ligatures w14:val="none"/>
+        </w:rPr>
+      </w:pPr>
+      <w:r>
+        <w:rPr>
+          <w:rFonts w:ascii="Times New Roman" w:eastAsia="Times New Roman" w:hAnsi="Times New Roman" w:cs="Times New Roman"/>
+          <w:kern w:val="0"/>
+          <w14:ligatures w14:val="none"/>
+        </w:rPr>
+        <w:t>`</w:t>
+      </w:r>
       <w:r>
         <w:rPr>
           <w:rFonts w:ascii="Times New Roman" w:eastAsia="Times New Roman" w:hAnsi="Times New Roman" w:cs="Times New Roman"/>
@@ -3311,27 +3259,7 @@
           <w:szCs w:val="22"/>
           <w14:ligatures w14:val="none"/>
         </w:rPr>
-        <w:t xml:space="preserve">What will be the best type of listing (property type, room type and accommodates for) for the top </w:t>
-      </w:r>
-      <w:r>
-        <w:rPr>
-          <w:rFonts w:ascii="Arial" w:eastAsia="Times New Roman" w:hAnsi="Arial" w:cs="Arial"/>
-          <w:kern w:val="0"/>
-          <w:sz w:val="5"/>
-          <w:szCs w:val="5"/>
-          <w14:ligatures w14:val="none"/>
-        </w:rPr>
-        <w:t>1</w:t>
-      </w:r>
-      <w:r>
-        <w:rPr>
-          <w:rFonts w:ascii="Arial" w:eastAsia="Times New Roman" w:hAnsi="Arial" w:cs="Arial"/>
-          <w:kern w:val="0"/>
-          <w:sz w:val="22"/>
-          <w:szCs w:val="22"/>
-          <w14:ligatures w14:val="none"/>
-        </w:rPr>
-        <w:t>5 “listing_neighbourhood” (in terms of estimated revenue per active listing) to have the highest number of stays?</w:t>
+        <w:t>What will be the best type of listing (property type, room type and accommodates for) for the top 5 “listing_neighbourhood” (in terms of estimated revenue per active listing) to have the highest number of stays?</w:t>
       </w:r>
     </w:p>
     <w:p>

</xml_diff>

<commit_message>
Final version last details
</commit_message>
<xml_diff>
--- a/Big Data Engineering Instructions.docx
+++ b/Big Data Engineering Instructions.docx
@@ -3389,27 +3389,7 @@
           <w:szCs w:val="22"/>
           <w14:ligatures w14:val="none"/>
         </w:rPr>
-        <w:t>does the estimated revenue over the last 1</w:t>
-      </w:r>
-      <w:r>
-        <w:rPr>
-          <w:rFonts w:ascii="Arial" w:eastAsia="Times New Roman" w:hAnsi="Arial" w:cs="Arial"/>
-          <w:kern w:val="0"/>
-          <w:sz w:val="5"/>
-          <w:szCs w:val="5"/>
-          <w14:ligatures w14:val="none"/>
-        </w:rPr>
-        <w:t>1</w:t>
-      </w:r>
-      <w:r>
-        <w:rPr>
-          <w:rFonts w:ascii="Arial" w:eastAsia="Times New Roman" w:hAnsi="Arial" w:cs="Arial"/>
-          <w:kern w:val="0"/>
-          <w:sz w:val="22"/>
-          <w:szCs w:val="22"/>
-          <w14:ligatures w14:val="none"/>
-        </w:rPr>
-        <w:t>2 months cover the annualised median mortgage repayment in the corresponding LGA? Which LGA has the highest percentage of hosts that can cover it?</w:t>
+        <w:t>does the estimated revenue over the last 12 months cover the annualised median mortgage repayment in the corresponding LGA? Which LGA has the highest percentage of hosts that can cover it?</w:t>
       </w:r>
     </w:p>
     <w:p>

</xml_diff>